<commit_message>
Update product documentation and add missing specification tables
- Revised the review_sick.docx to enhance product descriptions for items lacking Features/Benefits, including detailed specifications.
- Introduced a new Excel file (SICK - bai thieu bang thong so.xlsx) to address missing specification tables for various products.
- Adjusted technical data sourcing for standard product lines to improve accuracy and relevance.
</commit_message>
<xml_diff>
--- a/data/review_sick.docx
+++ b/data/review_sick.docx
@@ -54,6 +54,37 @@
       </w:pPr>
       <w:r>
         <w:rPr>
+          <w:color w:val="ff0000"/>
+          <w:rtl w:val="0"/>
+        </w:rPr>
+        <w:t xml:space="preserve">Mô tả thông số: [Loại sản phẩm] [Tên dòng SP]</w:t>
+      </w:r>
+      <w:r>
+        <w:rPr>
+          <w:rtl w:val="0"/>
+        </w:rPr>
+        <w:t xml:space="preserve"> là sản phẩm công nghiệp chính hãng của </w:t>
+      </w:r>
+      <w:r>
+        <w:rPr>
+          <w:color w:val="ff0000"/>
+          <w:rtl w:val="0"/>
+        </w:rPr>
+        <w:t xml:space="preserve">[thương hiệu]</w:t>
+      </w:r>
+      <w:r>
+        <w:rPr>
+          <w:rtl w:val="0"/>
+        </w:rPr>
+        <w:t xml:space="preserve">; bảng mã sản phẩm chi tiết như bảng dưới:</w:t>
+      </w:r>
+    </w:p>
+    <w:p>
+      <w:pPr>
+        <w:rPr/>
+      </w:pPr>
+      <w:r>
+        <w:rPr>
           <w:rtl w:val="0"/>
         </w:rPr>
       </w:r>
@@ -86,12 +117,12 @@
           <wp:inline distB="114300" distT="114300" distL="114300" distR="114300">
             <wp:extent cx="5731200" cy="2603500"/>
             <wp:effectExtent b="0" l="0" r="0" t="0"/>
-            <wp:docPr id="6" name="image6.png"/>
+            <wp:docPr id="6" name="image5.png"/>
             <a:graphic>
               <a:graphicData uri="http://schemas.openxmlformats.org/drawingml/2006/picture">
                 <pic:pic>
                   <pic:nvPicPr>
-                    <pic:cNvPr id="0" name="image6.png"/>
+                    <pic:cNvPr id="0" name="image5.png"/>
                     <pic:cNvPicPr preferRelativeResize="0"/>
                   </pic:nvPicPr>
                   <pic:blipFill>
@@ -154,17 +185,125 @@
         <w:rPr/>
       </w:pPr>
       <w:r>
+        <w:rPr>
+          <w:color w:val="ff0000"/>
+          <w:rtl w:val="0"/>
+        </w:rPr>
+        <w:t xml:space="preserve">Mô tả thông số: [Loại sản phẩm] [Tên dòng SP] [Thương hiệu] </w:t>
+      </w:r>
+      <w:r>
+        <w:rPr>
+          <w:rtl w:val="0"/>
+        </w:rPr>
+        <w:t xml:space="preserve">là thiết bị công nghiệp được sử dụng trong các hệ thống tự động hóa và điều khiển công nghiệp, đáp ứng các yêu cầu về độ chính xác, độ ổn định và độ tin cậy trong quá trình vận hành. Sản phẩm được thiết kế phù hợp với nhiều ứng dụng trong nhà máy và dây chuyền sản xuất, hỗ trợ đo lường, phát hiện, giám sát, điều khiển và tối ưu hóa quy trình.</w:t>
+      </w:r>
+    </w:p>
+    <w:p>
+      <w:pPr>
+        <w:rPr/>
+      </w:pPr>
+      <w:r>
+        <w:rPr>
+          <w:rtl w:val="0"/>
+        </w:rPr>
+      </w:r>
+    </w:p>
+    <w:p>
+      <w:pPr>
+        <w:rPr/>
+      </w:pPr>
+      <w:r>
+        <w:rPr>
+          <w:color w:val="ff0000"/>
+          <w:rtl w:val="0"/>
+        </w:rPr>
+        <w:t xml:space="preserve">[Loại sản phẩm] [Tên dòng SP] </w:t>
+      </w:r>
+      <w:r>
+        <w:rPr>
+          <w:rtl w:val="0"/>
+        </w:rPr>
+        <w:t xml:space="preserve">được sản xuất theo các tiêu chuẩn kỹ thuật của </w:t>
+      </w:r>
+      <w:r>
+        <w:rPr>
+          <w:color w:val="ff0000"/>
+          <w:rtl w:val="0"/>
+        </w:rPr>
+        <w:t xml:space="preserve">[Thương hiệu]</w:t>
+      </w:r>
+      <w:r>
+        <w:rPr>
+          <w:rtl w:val="0"/>
+        </w:rPr>
+        <w:t xml:space="preserve">, với các thông số kỹ thuật được công bố rõ ràng, giúp kỹ sư và bộ phận kỹ thuật dễ dàng lựa chọn, tích hợp và triển khai vào hệ thống tự động hóa.</w:t>
+      </w:r>
+    </w:p>
+    <w:p>
+      <w:pPr>
+        <w:rPr/>
+      </w:pPr>
+      <w:r>
+        <w:rPr>
+          <w:rtl w:val="0"/>
+        </w:rPr>
+      </w:r>
+    </w:p>
+    <w:p>
+      <w:pPr>
+        <w:rPr/>
+      </w:pPr>
+      <w:r>
+        <w:rPr>
+          <w:rtl w:val="0"/>
+        </w:rPr>
+        <w:t xml:space="preserve">Tùy thuộc vào từng model, sản phẩm có thể có các tùy chọn khác nhau về kích thước, phạm vi hoạt động, nguồn cấp, tín hiệu đầu ra, giao diện kết nối, cấp bảo vệ và điều kiện môi trường, đáp ứng đa dạng yêu cầu của các ứng dụng công nghiệp.</w:t>
+      </w:r>
+    </w:p>
+    <w:p>
+      <w:pPr>
+        <w:rPr/>
+      </w:pPr>
+      <w:r>
+        <w:rPr>
+          <w:rtl w:val="0"/>
+        </w:rPr>
+      </w:r>
+    </w:p>
+    <w:p>
+      <w:pPr>
+        <w:rPr>
+          <w:color w:val="ff0000"/>
+        </w:rPr>
+      </w:pPr>
+      <w:r>
+        <w:rPr>
+          <w:rtl w:val="0"/>
+        </w:rPr>
+        <w:t xml:space="preserve">Dưới đây là bảng thông số kỹ thuật chi tiết của sản phẩm:</w:t>
+      </w:r>
+      <w:r>
+        <w:rPr>
+          <w:rtl w:val="0"/>
+        </w:rPr>
+      </w:r>
+    </w:p>
+    <w:p>
+      <w:pPr>
+        <w:rPr/>
+      </w:pPr>
+      <w:r>
         <w:rPr/>
         <w:drawing>
           <wp:inline distB="114300" distT="114300" distL="114300" distR="114300">
             <wp:extent cx="5731200" cy="2171700"/>
             <wp:effectExtent b="0" l="0" r="0" t="0"/>
-            <wp:docPr id="3" name="image7.png"/>
+            <wp:docPr id="3" name="image6.png"/>
             <a:graphic>
               <a:graphicData uri="http://schemas.openxmlformats.org/drawingml/2006/picture">
                 <pic:pic>
                   <pic:nvPicPr>
-                    <pic:cNvPr id="0" name="image7.png"/>
+                    <pic:cNvPr id="0" name="image6.png"/>
                     <pic:cNvPicPr preferRelativeResize="0"/>
                   </pic:nvPicPr>
                   <pic:blipFill>
@@ -224,12 +363,12 @@
           <wp:inline distB="114300" distT="114300" distL="114300" distR="114300">
             <wp:extent cx="5731200" cy="2565400"/>
             <wp:effectExtent b="0" l="0" r="0" t="0"/>
-            <wp:docPr id="2" name="image4.png"/>
+            <wp:docPr id="2" name="image7.png"/>
             <a:graphic>
               <a:graphicData uri="http://schemas.openxmlformats.org/drawingml/2006/picture">
                 <pic:pic>
                   <pic:nvPicPr>
-                    <pic:cNvPr id="0" name="image4.png"/>
+                    <pic:cNvPr id="0" name="image7.png"/>
                     <pic:cNvPicPr preferRelativeResize="0"/>
                   </pic:nvPicPr>
                   <pic:blipFill>
@@ -297,12 +436,12 @@
           <wp:inline distB="114300" distT="114300" distL="114300" distR="114300">
             <wp:extent cx="5043488" cy="2639034"/>
             <wp:effectExtent b="0" l="0" r="0" t="0"/>
-            <wp:docPr id="8" name="image3.png"/>
+            <wp:docPr id="8" name="image2.png"/>
             <a:graphic>
               <a:graphicData uri="http://schemas.openxmlformats.org/drawingml/2006/picture">
                 <pic:pic>
                   <pic:nvPicPr>
-                    <pic:cNvPr id="0" name="image3.png"/>
+                    <pic:cNvPr id="0" name="image2.png"/>
                     <pic:cNvPicPr preferRelativeResize="0"/>
                   </pic:nvPicPr>
                   <pic:blipFill>
@@ -434,12 +573,12 @@
             <wp:extent cx="4555744" cy="2610850"/>
             <wp:effectExtent b="0" l="0" r="0" t="0"/>
             <wp:wrapNone/>
-            <wp:docPr id="4" name="image5.png"/>
+            <wp:docPr id="4" name="image4.png"/>
             <a:graphic>
               <a:graphicData uri="http://schemas.openxmlformats.org/drawingml/2006/picture">
                 <pic:pic>
                   <pic:nvPicPr>
-                    <pic:cNvPr id="0" name="image5.png"/>
+                    <pic:cNvPr id="0" name="image4.png"/>
                     <pic:cNvPicPr preferRelativeResize="0"/>
                   </pic:nvPicPr>
                   <pic:blipFill>
@@ -497,12 +636,12 @@
             <wp:extent cx="4833938" cy="4752695"/>
             <wp:effectExtent b="0" l="0" r="0" t="0"/>
             <wp:wrapNone/>
-            <wp:docPr id="5" name="image2.png"/>
+            <wp:docPr id="5" name="image3.png"/>
             <a:graphic>
               <a:graphicData uri="http://schemas.openxmlformats.org/drawingml/2006/picture">
                 <pic:pic>
                   <pic:nvPicPr>
-                    <pic:cNvPr id="0" name="image2.png"/>
+                    <pic:cNvPr id="0" name="image3.png"/>
                     <pic:cNvPicPr preferRelativeResize="0"/>
                   </pic:nvPicPr>
                   <pic:blipFill>
@@ -988,12 +1127,12 @@
             <wp:extent cx="4833938" cy="4752695"/>
             <wp:effectExtent b="0" l="0" r="0" t="0"/>
             <wp:wrapNone/>
-            <wp:docPr id="1" name="image2.png"/>
+            <wp:docPr id="1" name="image3.png"/>
             <a:graphic>
               <a:graphicData uri="http://schemas.openxmlformats.org/drawingml/2006/picture">
                 <pic:pic>
                   <pic:nvPicPr>
-                    <pic:cNvPr id="0" name="image2.png"/>
+                    <pic:cNvPr id="0" name="image3.png"/>
                     <pic:cNvPicPr preferRelativeResize="0"/>
                   </pic:nvPicPr>
                   <pic:blipFill>

</xml_diff>